<commit_message>
feature: minh update doc
</commit_message>
<xml_diff>
--- a/Group16_Report_v10.docx
+++ b/Group16_Report_v10.docx
@@ -5876,110 +5876,1466 @@
     </w:p>
     <w:p>
       <w:pPr>
-        <w:pStyle w:val="Heading3"/>
+        <w:pStyle w:val="Heading1"/>
         <w:spacing w:line="276" w:lineRule="auto"/>
-      </w:pPr>
-      <w:r>
+        <w:rPr>
+          <w:sz w:val="26"/>
+          <w:szCs w:val="26"/>
+        </w:rPr>
+      </w:pPr>
+      <w:r>
+        <w:rPr>
+          <w:sz w:val="26"/>
+          <w:szCs w:val="26"/>
+        </w:rPr>
         <w:t>Khối 3 — PhoBERT Encoder, Aspect-Aware Attention Pooling và Dual Head</w:t>
       </w:r>
     </w:p>
     <w:p>
       <w:pPr>
+        <w:pStyle w:val="Heading2"/>
         <w:spacing w:line="276" w:lineRule="auto"/>
-      </w:pPr>
-      <w:r>
-        <w:t>PhoBERT encoder nhận input_ids và attention_mask, sinh hidden states H = [h₁, ..., h_T], trong đó h_j ∈ ℝ⁷⁶⁸ là vector ngữ cảnh của token j. Với cấu hình cls_only, mô hình dùng hidden size 768 nên checkpoint nhẹ hơn và tổng quát tốt hơn trên test set so với concat_4_layers.</w:t>
-      </w:r>
-    </w:p>
-    <w:p>
-      <w:pPr>
+        <w:rPr>
+          <w:sz w:val="26"/>
+          <w:szCs w:val="26"/>
+        </w:rPr>
+      </w:pPr>
+      <w:r>
+        <w:rPr>
+          <w:sz w:val="26"/>
+          <w:szCs w:val="26"/>
+        </w:rPr>
+        <w:t>PhoBERT Encoder</w:t>
+      </w:r>
+    </w:p>
+    <w:p>
+      <w:pPr>
+        <w:spacing w:after="60" w:line="276" w:lineRule="auto"/>
+      </w:pPr>
+      <w:r>
+        <w:t xml:space="preserve">PhoBERT encoder nhận </w:t>
+      </w:r>
+      <w:r>
+        <w:rPr>
+          <w:rFonts w:eastAsia="Consolas"/>
+        </w:rPr>
+        <w:t>input_ids</w:t>
+      </w:r>
+      <w:r>
+        <w:t xml:space="preserve"> và </w:t>
+      </w:r>
+      <w:r>
+        <w:rPr>
+          <w:rFonts w:eastAsia="Consolas"/>
+        </w:rPr>
+        <w:t>attention_mask</w:t>
+      </w:r>
+      <w:r>
+        <w:t>, sinh hidden states:</w:t>
+      </w:r>
+    </w:p>
+    <w:p>
+      <w:pPr>
+        <w:spacing w:before="160" w:after="160" w:line="276" w:lineRule="auto"/>
+        <w:jc w:val="center"/>
+      </w:pPr>
+      <m:oMathPara>
+        <m:oMath>
+          <m:r>
+            <w:rPr>
+              <w:rFonts w:ascii="Cambria Math" w:hAnsi="Cambria Math"/>
+            </w:rPr>
+            <m:t>H = [</m:t>
+          </m:r>
+          <m:sSub>
+            <m:sSubPr>
+              <m:ctrlPr>
+                <w:rPr>
+                  <w:rFonts w:ascii="Cambria Math" w:hAnsi="Cambria Math"/>
+                </w:rPr>
+              </m:ctrlPr>
+            </m:sSubPr>
+            <m:e>
+              <m:r>
+                <w:rPr>
+                  <w:rFonts w:ascii="Cambria Math" w:hAnsi="Cambria Math"/>
+                </w:rPr>
+                <m:t>h</m:t>
+              </m:r>
+            </m:e>
+            <m:sub>
+              <m:r>
+                <w:rPr>
+                  <w:rFonts w:ascii="Cambria Math" w:hAnsi="Cambria Math"/>
+                </w:rPr>
+                <m:t>1</m:t>
+              </m:r>
+            </m:sub>
+          </m:sSub>
+          <m:r>
+            <w:rPr>
+              <w:rFonts w:ascii="Cambria Math" w:hAnsi="Cambria Math"/>
+            </w:rPr>
+            <m:t xml:space="preserve">, … , </m:t>
+          </m:r>
+          <m:sSub>
+            <m:sSubPr>
+              <m:ctrlPr>
+                <w:rPr>
+                  <w:rFonts w:ascii="Cambria Math" w:hAnsi="Cambria Math"/>
+                </w:rPr>
+              </m:ctrlPr>
+            </m:sSubPr>
+            <m:e>
+              <m:r>
+                <w:rPr>
+                  <w:rFonts w:ascii="Cambria Math" w:hAnsi="Cambria Math"/>
+                </w:rPr>
+                <m:t>h</m:t>
+              </m:r>
+            </m:e>
+            <m:sub>
+              <m:r>
+                <w:rPr>
+                  <w:rFonts w:ascii="Cambria Math" w:hAnsi="Cambria Math"/>
+                </w:rPr>
+                <m:t>T</m:t>
+              </m:r>
+            </m:sub>
+          </m:sSub>
+          <m:r>
+            <w:rPr>
+              <w:rFonts w:ascii="Cambria Math" w:hAnsi="Cambria Math"/>
+            </w:rPr>
+            <m:t>]</m:t>
+          </m:r>
+        </m:oMath>
+      </m:oMathPara>
+    </w:p>
+    <w:p>
+      <w:pPr>
+        <w:spacing w:after="120" w:line="276" w:lineRule="auto"/>
+      </w:pPr>
+      <w:r>
+        <w:t xml:space="preserve">trong đó </w:t>
+      </w:r>
+      <m:oMath>
+        <m:sSub>
+          <m:sSubPr>
+            <m:ctrlPr>
+              <w:rPr>
+                <w:rFonts w:ascii="Cambria Math" w:hAnsi="Cambria Math"/>
+              </w:rPr>
+            </m:ctrlPr>
+          </m:sSubPr>
+          <m:e>
+            <m:r>
+              <w:rPr>
+                <w:rFonts w:ascii="Cambria Math" w:hAnsi="Cambria Math"/>
+              </w:rPr>
+              <m:t>h</m:t>
+            </m:r>
+          </m:e>
+          <m:sub>
+            <m:r>
+              <w:rPr>
+                <w:rFonts w:ascii="Cambria Math" w:hAnsi="Cambria Math"/>
+              </w:rPr>
+              <m:t>j</m:t>
+            </m:r>
+          </m:sub>
+        </m:sSub>
+      </m:oMath>
+      <w:r>
+        <w:t xml:space="preserve"> </w:t>
+      </w:r>
+      <w:r>
+        <w:rPr>
+          <w:rFonts w:ascii="Cambria Math" w:hAnsi="Cambria Math" w:cs="Cambria Math"/>
+        </w:rPr>
+        <w:t>∈</w:t>
+      </w:r>
+      <w:r>
+        <w:t xml:space="preserve"> </w:t>
+      </w:r>
+      <m:oMath>
+        <m:sSup>
+          <m:sSupPr>
+            <m:ctrlPr>
+              <w:rPr>
+                <w:rFonts w:ascii="Cambria Math" w:hAnsi="Cambria Math"/>
+              </w:rPr>
+            </m:ctrlPr>
+          </m:sSupPr>
+          <m:e>
+            <m:r>
+              <m:rPr>
+                <m:scr m:val="double-struck"/>
+              </m:rPr>
+              <w:rPr>
+                <w:rFonts w:ascii="Cambria Math" w:hAnsi="Cambria Math"/>
+              </w:rPr>
+              <m:t>R</m:t>
+            </m:r>
+          </m:e>
+          <m:sup>
+            <m:r>
+              <w:rPr>
+                <w:rFonts w:ascii="Cambria Math" w:hAnsi="Cambria Math"/>
+              </w:rPr>
+              <m:t>768</m:t>
+            </m:r>
+          </m:sup>
+        </m:sSup>
+      </m:oMath>
+      <w:r>
+        <w:t xml:space="preserve"> là vector ngữ cảnh của token j. Với cấu hình </w:t>
+      </w:r>
+      <w:r>
+        <w:rPr>
+          <w:rFonts w:eastAsia="Consolas"/>
+        </w:rPr>
+        <w:t>cls_only</w:t>
+      </w:r>
+      <w:r>
+        <w:t xml:space="preserve">, mô hình dùng hidden size 768 nên checkpoint nhẹ hơn và tổng quát tốt hơn trên test set so với </w:t>
+      </w:r>
+      <w:r>
+        <w:rPr>
+          <w:rFonts w:eastAsia="Consolas"/>
+        </w:rPr>
+        <w:t>concat_4_layers</w:t>
+      </w:r>
+      <w:r>
+        <w:t>.</w:t>
+      </w:r>
+    </w:p>
+    <w:p>
+      <w:pPr>
+        <w:pStyle w:val="Heading2"/>
         <w:spacing w:line="276" w:lineRule="auto"/>
-      </w:pPr>
-      <w:r>
-        <w:t>Aspect-Aware Attention Pooling học một query vector q_i ∈ ℝ¹²⁸ cho mỗi aspect i. Hidden state từng token được chiếu xuống cùng không gian 128 chiều bằng W_proj, sau đó tính attention score giữa aspect query và token key.</w:t>
-      </w:r>
-    </w:p>
-    <w:p>
-      <w:pPr>
+        <w:rPr>
+          <w:sz w:val="26"/>
+          <w:szCs w:val="26"/>
+        </w:rPr>
+      </w:pPr>
+      <w:r>
+        <w:rPr>
+          <w:sz w:val="26"/>
+          <w:szCs w:val="26"/>
+        </w:rPr>
+        <w:t>Aspect-Aware Attention Pooling</w:t>
+      </w:r>
+    </w:p>
+    <w:p>
+      <w:pPr>
+        <w:spacing w:after="120" w:line="276" w:lineRule="auto"/>
+      </w:pPr>
+      <w:r>
+        <w:t xml:space="preserve">Cơ chế này học một query vector </w:t>
+      </w:r>
+      <m:oMath>
+        <m:sSub>
+          <m:sSubPr>
+            <m:ctrlPr>
+              <w:rPr>
+                <w:rFonts w:ascii="Cambria Math" w:hAnsi="Cambria Math"/>
+              </w:rPr>
+            </m:ctrlPr>
+          </m:sSubPr>
+          <m:e>
+            <m:r>
+              <w:rPr>
+                <w:rFonts w:ascii="Cambria Math" w:hAnsi="Cambria Math"/>
+              </w:rPr>
+              <m:t>q</m:t>
+            </m:r>
+          </m:e>
+          <m:sub>
+            <m:r>
+              <w:rPr>
+                <w:rFonts w:ascii="Cambria Math" w:hAnsi="Cambria Math"/>
+              </w:rPr>
+              <m:t>i</m:t>
+            </m:r>
+          </m:sub>
+        </m:sSub>
+      </m:oMath>
+      <w:r>
+        <w:t xml:space="preserve"> </w:t>
+      </w:r>
+      <w:r>
+        <w:rPr>
+          <w:rFonts w:ascii="Cambria Math" w:hAnsi="Cambria Math" w:cs="Cambria Math"/>
+        </w:rPr>
+        <w:t>∈</w:t>
+      </w:r>
+      <w:r>
+        <w:t xml:space="preserve"> </w:t>
+      </w:r>
+      <m:oMath>
+        <m:sSup>
+          <m:sSupPr>
+            <m:ctrlPr>
+              <w:rPr>
+                <w:rFonts w:ascii="Cambria Math" w:hAnsi="Cambria Math"/>
+              </w:rPr>
+            </m:ctrlPr>
+          </m:sSupPr>
+          <m:e>
+            <m:r>
+              <m:rPr>
+                <m:scr m:val="double-struck"/>
+              </m:rPr>
+              <w:rPr>
+                <w:rFonts w:ascii="Cambria Math" w:hAnsi="Cambria Math"/>
+              </w:rPr>
+              <m:t>R</m:t>
+            </m:r>
+          </m:e>
+          <m:sup>
+            <m:r>
+              <w:rPr>
+                <w:rFonts w:ascii="Cambria Math" w:hAnsi="Cambria Math"/>
+              </w:rPr>
+              <m:t>128</m:t>
+            </m:r>
+          </m:sup>
+        </m:sSup>
+      </m:oMath>
+      <w:r>
+        <w:t xml:space="preserve"> cho mỗi aspect i. Hidden state từng token được chiếu xuống cùng không gian 128 chiều bằng </w:t>
+      </w:r>
+      <m:oMath>
+        <m:sSub>
+          <m:sSubPr>
+            <m:ctrlPr>
+              <w:rPr>
+                <w:rFonts w:ascii="Cambria Math" w:hAnsi="Cambria Math"/>
+              </w:rPr>
+            </m:ctrlPr>
+          </m:sSubPr>
+          <m:e>
+            <m:r>
+              <w:rPr>
+                <w:rFonts w:ascii="Cambria Math" w:hAnsi="Cambria Math"/>
+              </w:rPr>
+              <m:t>W</m:t>
+            </m:r>
+          </m:e>
+          <m:sub>
+            <m:r>
+              <w:rPr>
+                <w:rFonts w:ascii="Cambria Math" w:hAnsi="Cambria Math"/>
+              </w:rPr>
+              <m:t>proj</m:t>
+            </m:r>
+          </m:sub>
+        </m:sSub>
+      </m:oMath>
+      <w:r>
+        <w:t>, sau đó tính attention score giữa aspect query và token key.</w:t>
+      </w:r>
+    </w:p>
+    <w:p>
+      <w:pPr>
+        <w:spacing w:before="200" w:after="100" w:line="276" w:lineRule="auto"/>
+      </w:pPr>
+      <w:r>
+        <w:rPr>
+          <w:b/>
+          <w:bCs/>
+          <w:i/>
+          <w:iCs/>
+        </w:rPr>
+        <w:t>Công thức Aspect-Aware Attention Pooling</w:t>
+      </w:r>
+      <w:r>
+        <w:t xml:space="preserve">, với V là tập token hợp lệ sau khi loại padding bằng </w:t>
+      </w:r>
+      <w:r>
+        <w:rPr>
+          <w:rFonts w:eastAsia="Consolas"/>
+        </w:rPr>
+        <w:t>attention_mask</w:t>
+      </w:r>
+      <w:r>
+        <w:t>:</w:t>
+      </w:r>
+    </w:p>
+    <w:p>
+      <w:pPr>
+        <w:spacing w:before="160" w:after="80" w:line="276" w:lineRule="auto"/>
+        <w:jc w:val="center"/>
+      </w:pPr>
+      <m:oMathPara>
+        <m:oMath>
+          <m:sSub>
+            <m:sSubPr>
+              <m:ctrlPr>
+                <w:rPr>
+                  <w:rFonts w:ascii="Cambria Math" w:hAnsi="Cambria Math"/>
+                </w:rPr>
+              </m:ctrlPr>
+            </m:sSubPr>
+            <m:e>
+              <m:r>
+                <w:rPr>
+                  <w:rFonts w:ascii="Cambria Math" w:hAnsi="Cambria Math"/>
+                </w:rPr>
+                <m:t>k</m:t>
+              </m:r>
+            </m:e>
+            <m:sub>
+              <m:r>
+                <w:rPr>
+                  <w:rFonts w:ascii="Cambria Math" w:hAnsi="Cambria Math"/>
+                </w:rPr>
+                <m:t>j</m:t>
+              </m:r>
+            </m:sub>
+          </m:sSub>
+          <m:r>
+            <w:rPr>
+              <w:rFonts w:ascii="Cambria Math" w:hAnsi="Cambria Math"/>
+            </w:rPr>
+            <m:t xml:space="preserve"> = tanh(</m:t>
+          </m:r>
+          <m:sSub>
+            <m:sSubPr>
+              <m:ctrlPr>
+                <w:rPr>
+                  <w:rFonts w:ascii="Cambria Math" w:hAnsi="Cambria Math"/>
+                </w:rPr>
+              </m:ctrlPr>
+            </m:sSubPr>
+            <m:e>
+              <m:r>
+                <w:rPr>
+                  <w:rFonts w:ascii="Cambria Math" w:hAnsi="Cambria Math"/>
+                </w:rPr>
+                <m:t>W</m:t>
+              </m:r>
+            </m:e>
+            <m:sub>
+              <m:r>
+                <w:rPr>
+                  <w:rFonts w:ascii="Cambria Math" w:hAnsi="Cambria Math"/>
+                </w:rPr>
+                <m:t>proj</m:t>
+              </m:r>
+            </m:sub>
+          </m:sSub>
+          <m:r>
+            <w:rPr>
+              <w:rFonts w:ascii="Cambria Math" w:hAnsi="Cambria Math"/>
+            </w:rPr>
+            <m:t xml:space="preserve"> · </m:t>
+          </m:r>
+          <m:sSub>
+            <m:sSubPr>
+              <m:ctrlPr>
+                <w:rPr>
+                  <w:rFonts w:ascii="Cambria Math" w:hAnsi="Cambria Math"/>
+                </w:rPr>
+              </m:ctrlPr>
+            </m:sSubPr>
+            <m:e>
+              <m:r>
+                <w:rPr>
+                  <w:rFonts w:ascii="Cambria Math" w:hAnsi="Cambria Math"/>
+                </w:rPr>
+                <m:t>h</m:t>
+              </m:r>
+            </m:e>
+            <m:sub>
+              <m:r>
+                <w:rPr>
+                  <w:rFonts w:ascii="Cambria Math" w:hAnsi="Cambria Math"/>
+                </w:rPr>
+                <m:t>j</m:t>
+              </m:r>
+            </m:sub>
+          </m:sSub>
+          <m:r>
+            <w:rPr>
+              <w:rFonts w:ascii="Cambria Math" w:hAnsi="Cambria Math"/>
+            </w:rPr>
+            <m:t xml:space="preserve"> + </m:t>
+          </m:r>
+          <m:sSub>
+            <m:sSubPr>
+              <m:ctrlPr>
+                <w:rPr>
+                  <w:rFonts w:ascii="Cambria Math" w:hAnsi="Cambria Math"/>
+                </w:rPr>
+              </m:ctrlPr>
+            </m:sSubPr>
+            <m:e>
+              <m:r>
+                <w:rPr>
+                  <w:rFonts w:ascii="Cambria Math" w:hAnsi="Cambria Math"/>
+                </w:rPr>
+                <m:t>b</m:t>
+              </m:r>
+            </m:e>
+            <m:sub>
+              <m:r>
+                <w:rPr>
+                  <w:rFonts w:ascii="Cambria Math" w:hAnsi="Cambria Math"/>
+                </w:rPr>
+                <m:t>proj</m:t>
+              </m:r>
+            </m:sub>
+          </m:sSub>
+          <m:r>
+            <w:rPr>
+              <w:rFonts w:ascii="Cambria Math" w:hAnsi="Cambria Math"/>
+            </w:rPr>
+            <m:t>)</m:t>
+          </m:r>
+        </m:oMath>
+      </m:oMathPara>
+    </w:p>
+    <w:p>
+      <w:pPr>
+        <w:spacing w:after="120" w:line="276" w:lineRule="auto"/>
+        <w:jc w:val="center"/>
+      </w:pPr>
+      <w:r>
+        <w:rPr>
+          <w:i/>
+          <w:iCs/>
+        </w:rPr>
+        <w:t xml:space="preserve">với  </w:t>
+      </w:r>
+      <m:oMath>
+        <m:sSub>
+          <m:sSubPr>
+            <m:ctrlPr>
+              <w:rPr>
+                <w:rFonts w:ascii="Cambria Math" w:hAnsi="Cambria Math"/>
+              </w:rPr>
+            </m:ctrlPr>
+          </m:sSubPr>
+          <m:e>
+            <m:r>
+              <w:rPr>
+                <w:rFonts w:ascii="Cambria Math" w:hAnsi="Cambria Math"/>
+              </w:rPr>
+              <m:t>W</m:t>
+            </m:r>
+          </m:e>
+          <m:sub>
+            <m:r>
+              <w:rPr>
+                <w:rFonts w:ascii="Cambria Math" w:hAnsi="Cambria Math"/>
+              </w:rPr>
+              <m:t>proj</m:t>
+            </m:r>
+          </m:sub>
+        </m:sSub>
+      </m:oMath>
+      <w:r>
+        <w:t xml:space="preserve"> </w:t>
+      </w:r>
+      <w:r>
+        <w:rPr>
+          <w:rFonts w:ascii="Cambria Math" w:hAnsi="Cambria Math" w:cs="Cambria Math"/>
+        </w:rPr>
+        <w:t>∈</w:t>
+      </w:r>
+      <w:r>
+        <w:t xml:space="preserve"> </w:t>
+      </w:r>
+      <m:oMath>
+        <m:sSup>
+          <m:sSupPr>
+            <m:ctrlPr>
+              <w:rPr>
+                <w:rFonts w:ascii="Cambria Math" w:hAnsi="Cambria Math"/>
+              </w:rPr>
+            </m:ctrlPr>
+          </m:sSupPr>
+          <m:e>
+            <m:r>
+              <m:rPr>
+                <m:scr m:val="double-struck"/>
+              </m:rPr>
+              <w:rPr>
+                <w:rFonts w:ascii="Cambria Math" w:hAnsi="Cambria Math"/>
+              </w:rPr>
+              <m:t>R</m:t>
+            </m:r>
+          </m:e>
+          <m:sup>
+            <m:r>
+              <w:rPr>
+                <w:rFonts w:ascii="Cambria Math" w:hAnsi="Cambria Math"/>
+              </w:rPr>
+              <m:t>128×768</m:t>
+            </m:r>
+          </m:sup>
+        </m:sSup>
+      </m:oMath>
+    </w:p>
+    <w:p>
+      <w:pPr>
+        <w:spacing w:before="120" w:after="80" w:line="276" w:lineRule="auto"/>
+        <w:jc w:val="center"/>
+      </w:pPr>
+      <m:oMathPara>
+        <m:oMath>
+          <m:sSub>
+            <m:sSubPr>
+              <m:ctrlPr>
+                <w:rPr>
+                  <w:rFonts w:ascii="Cambria Math" w:hAnsi="Cambria Math"/>
+                </w:rPr>
+              </m:ctrlPr>
+            </m:sSubPr>
+            <m:e>
+              <m:r>
+                <w:rPr>
+                  <w:rFonts w:ascii="Cambria Math" w:hAnsi="Cambria Math"/>
+                </w:rPr>
+                <m:t>s</m:t>
+              </m:r>
+            </m:e>
+            <m:sub>
+              <m:r>
+                <w:rPr>
+                  <w:rFonts w:ascii="Cambria Math" w:hAnsi="Cambria Math"/>
+                </w:rPr>
+                <m:t>i,j</m:t>
+              </m:r>
+            </m:sub>
+          </m:sSub>
+          <m:r>
+            <w:rPr>
+              <w:rFonts w:ascii="Cambria Math" w:hAnsi="Cambria Math"/>
+            </w:rPr>
+            <m:t xml:space="preserve"> = </m:t>
+          </m:r>
+          <m:sSup>
+            <m:sSupPr>
+              <m:ctrlPr>
+                <w:rPr>
+                  <w:rFonts w:ascii="Cambria Math" w:hAnsi="Cambria Math"/>
+                </w:rPr>
+              </m:ctrlPr>
+            </m:sSupPr>
+            <m:e>
+              <m:sSub>
+                <m:sSubPr>
+                  <m:ctrlPr>
+                    <w:rPr>
+                      <w:rFonts w:ascii="Cambria Math" w:hAnsi="Cambria Math"/>
+                    </w:rPr>
+                  </m:ctrlPr>
+                </m:sSubPr>
+                <m:e>
+                  <m:r>
+                    <w:rPr>
+                      <w:rFonts w:ascii="Cambria Math" w:hAnsi="Cambria Math"/>
+                    </w:rPr>
+                    <m:t>q</m:t>
+                  </m:r>
+                </m:e>
+                <m:sub>
+                  <m:r>
+                    <w:rPr>
+                      <w:rFonts w:ascii="Cambria Math" w:hAnsi="Cambria Math"/>
+                    </w:rPr>
+                    <m:t>i</m:t>
+                  </m:r>
+                </m:sub>
+              </m:sSub>
+            </m:e>
+            <m:sup>
+              <m:r>
+                <w:rPr>
+                  <w:rFonts w:ascii="Cambria Math" w:hAnsi="Cambria Math"/>
+                </w:rPr>
+                <m:t>T</m:t>
+              </m:r>
+            </m:sup>
+          </m:sSup>
+          <m:r>
+            <w:rPr>
+              <w:rFonts w:ascii="Cambria Math" w:hAnsi="Cambria Math"/>
+            </w:rPr>
+            <m:t xml:space="preserve"> · </m:t>
+          </m:r>
+          <m:sSub>
+            <m:sSubPr>
+              <m:ctrlPr>
+                <w:rPr>
+                  <w:rFonts w:ascii="Cambria Math" w:hAnsi="Cambria Math"/>
+                </w:rPr>
+              </m:ctrlPr>
+            </m:sSubPr>
+            <m:e>
+              <m:r>
+                <w:rPr>
+                  <w:rFonts w:ascii="Cambria Math" w:hAnsi="Cambria Math"/>
+                </w:rPr>
+                <m:t>k</m:t>
+              </m:r>
+            </m:e>
+            <m:sub>
+              <m:r>
+                <w:rPr>
+                  <w:rFonts w:ascii="Cambria Math" w:hAnsi="Cambria Math"/>
+                </w:rPr>
+                <m:t>j</m:t>
+              </m:r>
+            </m:sub>
+          </m:sSub>
+        </m:oMath>
+      </m:oMathPara>
+    </w:p>
+    <w:p>
+      <w:pPr>
+        <w:spacing w:before="120" w:after="80" w:line="276" w:lineRule="auto"/>
+        <w:jc w:val="center"/>
+      </w:pPr>
+      <m:oMathPara>
+        <m:oMath>
+          <m:sSub>
+            <m:sSubPr>
+              <m:ctrlPr>
+                <w:rPr>
+                  <w:rFonts w:ascii="Cambria Math" w:hAnsi="Cambria Math"/>
+                </w:rPr>
+              </m:ctrlPr>
+            </m:sSubPr>
+            <m:e>
+              <m:r>
+                <w:rPr>
+                  <w:rFonts w:ascii="Cambria Math" w:hAnsi="Cambria Math"/>
+                </w:rPr>
+                <m:t>α</m:t>
+              </m:r>
+            </m:e>
+            <m:sub>
+              <m:r>
+                <w:rPr>
+                  <w:rFonts w:ascii="Cambria Math" w:hAnsi="Cambria Math"/>
+                </w:rPr>
+                <m:t>i,j</m:t>
+              </m:r>
+            </m:sub>
+          </m:sSub>
+          <m:r>
+            <w:rPr>
+              <w:rFonts w:ascii="Cambria Math" w:hAnsi="Cambria Math"/>
+            </w:rPr>
+            <m:t xml:space="preserve"> = </m:t>
+          </m:r>
+          <m:f>
+            <m:fPr>
+              <m:ctrlPr>
+                <w:rPr>
+                  <w:rFonts w:ascii="Cambria Math" w:hAnsi="Cambria Math"/>
+                </w:rPr>
+              </m:ctrlPr>
+            </m:fPr>
+            <m:num>
+              <m:r>
+                <w:rPr>
+                  <w:rFonts w:ascii="Cambria Math" w:hAnsi="Cambria Math"/>
+                </w:rPr>
+                <m:t>exp(</m:t>
+              </m:r>
+              <m:sSub>
+                <m:sSubPr>
+                  <m:ctrlPr>
+                    <w:rPr>
+                      <w:rFonts w:ascii="Cambria Math" w:hAnsi="Cambria Math"/>
+                    </w:rPr>
+                  </m:ctrlPr>
+                </m:sSubPr>
+                <m:e>
+                  <m:r>
+                    <w:rPr>
+                      <w:rFonts w:ascii="Cambria Math" w:hAnsi="Cambria Math"/>
+                    </w:rPr>
+                    <m:t>s</m:t>
+                  </m:r>
+                </m:e>
+                <m:sub>
+                  <m:r>
+                    <w:rPr>
+                      <w:rFonts w:ascii="Cambria Math" w:hAnsi="Cambria Math"/>
+                    </w:rPr>
+                    <m:t>i,j</m:t>
+                  </m:r>
+                </m:sub>
+              </m:sSub>
+              <m:r>
+                <w:rPr>
+                  <w:rFonts w:ascii="Cambria Math" w:hAnsi="Cambria Math"/>
+                </w:rPr>
+                <m:t>)</m:t>
+              </m:r>
+            </m:num>
+            <m:den>
+              <m:nary>
+                <m:naryPr>
+                  <m:chr m:val="∑"/>
+                  <m:limLoc m:val="undOvr"/>
+                  <m:supHide m:val="1"/>
+                  <m:ctrlPr>
+                    <w:rPr>
+                      <w:rFonts w:ascii="Cambria Math" w:hAnsi="Cambria Math"/>
+                    </w:rPr>
+                  </m:ctrlPr>
+                </m:naryPr>
+                <m:sub>
+                  <m:r>
+                    <w:rPr>
+                      <w:rFonts w:ascii="Cambria Math" w:hAnsi="Cambria Math"/>
+                    </w:rPr>
+                    <m:t>t∈V</m:t>
+                  </m:r>
+                </m:sub>
+                <m:sup/>
+                <m:e>
+                  <m:r>
+                    <w:rPr>
+                      <w:rFonts w:ascii="Cambria Math" w:hAnsi="Cambria Math"/>
+                    </w:rPr>
+                    <m:t>exp(</m:t>
+                  </m:r>
+                  <m:sSub>
+                    <m:sSubPr>
+                      <m:ctrlPr>
+                        <w:rPr>
+                          <w:rFonts w:ascii="Cambria Math" w:hAnsi="Cambria Math"/>
+                        </w:rPr>
+                      </m:ctrlPr>
+                    </m:sSubPr>
+                    <m:e>
+                      <m:r>
+                        <w:rPr>
+                          <w:rFonts w:ascii="Cambria Math" w:hAnsi="Cambria Math"/>
+                        </w:rPr>
+                        <m:t>s</m:t>
+                      </m:r>
+                    </m:e>
+                    <m:sub>
+                      <m:r>
+                        <w:rPr>
+                          <w:rFonts w:ascii="Cambria Math" w:hAnsi="Cambria Math"/>
+                        </w:rPr>
+                        <m:t>i,t</m:t>
+                      </m:r>
+                    </m:sub>
+                  </m:sSub>
+                  <m:r>
+                    <w:rPr>
+                      <w:rFonts w:ascii="Cambria Math" w:hAnsi="Cambria Math"/>
+                    </w:rPr>
+                    <m:t>)</m:t>
+                  </m:r>
+                </m:e>
+              </m:nary>
+            </m:den>
+          </m:f>
+        </m:oMath>
+      </m:oMathPara>
+    </w:p>
+    <w:p>
+      <w:pPr>
+        <w:spacing w:before="120" w:after="80" w:line="276" w:lineRule="auto"/>
+        <w:jc w:val="center"/>
+      </w:pPr>
+      <m:oMathPara>
+        <m:oMath>
+          <m:sSub>
+            <m:sSubPr>
+              <m:ctrlPr>
+                <w:rPr>
+                  <w:rFonts w:ascii="Cambria Math" w:hAnsi="Cambria Math"/>
+                </w:rPr>
+              </m:ctrlPr>
+            </m:sSubPr>
+            <m:e>
+              <m:r>
+                <w:rPr>
+                  <w:rFonts w:ascii="Cambria Math" w:hAnsi="Cambria Math"/>
+                </w:rPr>
+                <m:t>r</m:t>
+              </m:r>
+            </m:e>
+            <m:sub>
+              <m:r>
+                <w:rPr>
+                  <w:rFonts w:ascii="Cambria Math" w:hAnsi="Cambria Math"/>
+                </w:rPr>
+                <m:t>i</m:t>
+              </m:r>
+            </m:sub>
+          </m:sSub>
+          <m:r>
+            <w:rPr>
+              <w:rFonts w:ascii="Cambria Math" w:hAnsi="Cambria Math"/>
+            </w:rPr>
+            <m:t xml:space="preserve"> = </m:t>
+          </m:r>
+          <m:nary>
+            <m:naryPr>
+              <m:chr m:val="∑"/>
+              <m:limLoc m:val="undOvr"/>
+              <m:supHide m:val="1"/>
+              <m:ctrlPr>
+                <w:rPr>
+                  <w:rFonts w:ascii="Cambria Math" w:hAnsi="Cambria Math"/>
+                </w:rPr>
+              </m:ctrlPr>
+            </m:naryPr>
+            <m:sub>
+              <m:r>
+                <w:rPr>
+                  <w:rFonts w:ascii="Cambria Math" w:hAnsi="Cambria Math"/>
+                </w:rPr>
+                <m:t>j∈V</m:t>
+              </m:r>
+            </m:sub>
+            <m:sup/>
+            <m:e>
+              <m:sSub>
+                <m:sSubPr>
+                  <m:ctrlPr>
+                    <w:rPr>
+                      <w:rFonts w:ascii="Cambria Math" w:hAnsi="Cambria Math"/>
+                    </w:rPr>
+                  </m:ctrlPr>
+                </m:sSubPr>
+                <m:e>
+                  <m:r>
+                    <w:rPr>
+                      <w:rFonts w:ascii="Cambria Math" w:hAnsi="Cambria Math"/>
+                    </w:rPr>
+                    <m:t>α</m:t>
+                  </m:r>
+                </m:e>
+                <m:sub>
+                  <m:r>
+                    <w:rPr>
+                      <w:rFonts w:ascii="Cambria Math" w:hAnsi="Cambria Math"/>
+                    </w:rPr>
+                    <m:t>i,j</m:t>
+                  </m:r>
+                </m:sub>
+              </m:sSub>
+              <m:r>
+                <w:rPr>
+                  <w:rFonts w:ascii="Cambria Math" w:hAnsi="Cambria Math"/>
+                </w:rPr>
+                <m:t xml:space="preserve"> · </m:t>
+              </m:r>
+              <m:sSub>
+                <m:sSubPr>
+                  <m:ctrlPr>
+                    <w:rPr>
+                      <w:rFonts w:ascii="Cambria Math" w:hAnsi="Cambria Math"/>
+                    </w:rPr>
+                  </m:ctrlPr>
+                </m:sSubPr>
+                <m:e>
+                  <m:r>
+                    <w:rPr>
+                      <w:rFonts w:ascii="Cambria Math" w:hAnsi="Cambria Math"/>
+                    </w:rPr>
+                    <m:t>h</m:t>
+                  </m:r>
+                </m:e>
+                <m:sub>
+                  <m:r>
+                    <w:rPr>
+                      <w:rFonts w:ascii="Cambria Math" w:hAnsi="Cambria Math"/>
+                    </w:rPr>
+                    <m:t>j</m:t>
+                  </m:r>
+                </m:sub>
+              </m:sSub>
+            </m:e>
+          </m:nary>
+        </m:oMath>
+      </m:oMathPara>
+    </w:p>
+    <w:p>
+      <w:pPr>
+        <w:spacing w:after="160" w:line="276" w:lineRule="auto"/>
+        <w:jc w:val="center"/>
+      </w:pPr>
+      <w:r>
+        <w:rPr>
+          <w:i/>
+          <w:iCs/>
+        </w:rPr>
+        <w:t xml:space="preserve">với  </w:t>
+      </w:r>
+      <m:oMath>
+        <m:sSub>
+          <m:sSubPr>
+            <m:ctrlPr>
+              <w:rPr>
+                <w:rFonts w:ascii="Cambria Math" w:hAnsi="Cambria Math"/>
+              </w:rPr>
+            </m:ctrlPr>
+          </m:sSubPr>
+          <m:e>
+            <m:r>
+              <w:rPr>
+                <w:rFonts w:ascii="Cambria Math" w:hAnsi="Cambria Math"/>
+              </w:rPr>
+              <m:t>r</m:t>
+            </m:r>
+          </m:e>
+          <m:sub>
+            <m:r>
+              <w:rPr>
+                <w:rFonts w:ascii="Cambria Math" w:hAnsi="Cambria Math"/>
+              </w:rPr>
+              <m:t>i</m:t>
+            </m:r>
+          </m:sub>
+        </m:sSub>
+      </m:oMath>
+      <w:r>
+        <w:t xml:space="preserve"> </w:t>
+      </w:r>
+      <w:r>
+        <w:rPr>
+          <w:rFonts w:ascii="Cambria Math" w:hAnsi="Cambria Math" w:cs="Cambria Math"/>
+        </w:rPr>
+        <w:t>∈</w:t>
+      </w:r>
+      <w:r>
+        <w:t xml:space="preserve"> </w:t>
+      </w:r>
+      <m:oMath>
+        <m:sSup>
+          <m:sSupPr>
+            <m:ctrlPr>
+              <w:rPr>
+                <w:rFonts w:ascii="Cambria Math" w:hAnsi="Cambria Math"/>
+              </w:rPr>
+            </m:ctrlPr>
+          </m:sSupPr>
+          <m:e>
+            <m:r>
+              <m:rPr>
+                <m:scr m:val="double-struck"/>
+              </m:rPr>
+              <w:rPr>
+                <w:rFonts w:ascii="Cambria Math" w:hAnsi="Cambria Math"/>
+              </w:rPr>
+              <m:t>R</m:t>
+            </m:r>
+          </m:e>
+          <m:sup>
+            <m:r>
+              <w:rPr>
+                <w:rFonts w:ascii="Cambria Math" w:hAnsi="Cambria Math"/>
+              </w:rPr>
+              <m:t>768</m:t>
+            </m:r>
+          </m:sup>
+        </m:sSup>
+      </m:oMath>
+    </w:p>
+    <w:p>
+      <w:pPr>
+        <w:spacing w:after="120" w:line="276" w:lineRule="auto"/>
+      </w:pPr>
+      <w:r>
+        <w:t xml:space="preserve">Vector </w:t>
+      </w:r>
+      <m:oMath>
+        <m:sSub>
+          <m:sSubPr>
+            <m:ctrlPr>
+              <w:rPr>
+                <w:rFonts w:ascii="Cambria Math" w:hAnsi="Cambria Math"/>
+              </w:rPr>
+            </m:ctrlPr>
+          </m:sSubPr>
+          <m:e>
+            <m:r>
+              <w:rPr>
+                <w:rFonts w:ascii="Cambria Math" w:hAnsi="Cambria Math"/>
+              </w:rPr>
+              <m:t>r</m:t>
+            </m:r>
+          </m:e>
+          <m:sub>
+            <m:r>
+              <w:rPr>
+                <w:rFonts w:ascii="Cambria Math" w:hAnsi="Cambria Math"/>
+              </w:rPr>
+              <m:t>i</m:t>
+            </m:r>
+          </m:sub>
+        </m:sSub>
+      </m:oMath>
+      <w:r>
+        <w:t xml:space="preserve"> là representation riêng của aspect i. Ví dụ, với câu </w:t>
+      </w:r>
+      <w:r>
+        <w:rPr>
+          <w:i/>
+          <w:iCs/>
+        </w:rPr>
+        <w:t>"Phòng sạch nhưng nhân viên phục vụ chậm"</w:t>
+      </w:r>
+      <w:r>
+        <w:t xml:space="preserve">, aspect </w:t>
+      </w:r>
+      <w:r>
+        <w:rPr>
+          <w:rFonts w:eastAsia="Consolas"/>
+        </w:rPr>
+        <w:t>ROOMS#CLEANLINESS</w:t>
+      </w:r>
+      <w:r>
+        <w:t xml:space="preserve"> có xu hướng chú ý vào </w:t>
+      </w:r>
+      <w:r>
+        <w:rPr>
+          <w:i/>
+          <w:iCs/>
+        </w:rPr>
+        <w:t>"Phòng"</w:t>
+      </w:r>
+      <w:r>
+        <w:t xml:space="preserve">, </w:t>
+      </w:r>
+      <w:r>
+        <w:rPr>
+          <w:i/>
+          <w:iCs/>
+        </w:rPr>
+        <w:t>"sạch"</w:t>
+      </w:r>
+      <w:r>
+        <w:t xml:space="preserve">, còn </w:t>
+      </w:r>
+      <w:r>
+        <w:rPr>
+          <w:rFonts w:eastAsia="Consolas"/>
+        </w:rPr>
+        <w:t>SERVICE#GENERAL</w:t>
+      </w:r>
+      <w:r>
+        <w:t xml:space="preserve"> chú ý vào </w:t>
+      </w:r>
+      <w:r>
+        <w:rPr>
+          <w:i/>
+          <w:iCs/>
+        </w:rPr>
+        <w:t>"nhân_viên"</w:t>
+      </w:r>
+      <w:r>
+        <w:t xml:space="preserve">, </w:t>
+      </w:r>
+      <w:r>
+        <w:rPr>
+          <w:i/>
+          <w:iCs/>
+        </w:rPr>
+        <w:t>"phục_vụ"</w:t>
+      </w:r>
+      <w:r>
+        <w:t xml:space="preserve">, </w:t>
+      </w:r>
+      <w:r>
+        <w:rPr>
+          <w:i/>
+          <w:iCs/>
+        </w:rPr>
+        <w:t>"chậm"</w:t>
+      </w:r>
+      <w:r>
+        <w:t>. Đây là lý do attention pooling dễ giải thích hơn dùng một vector CLS chung cho mọi aspect.</w:t>
+      </w:r>
+    </w:p>
+    <w:p>
+      <w:pPr>
+        <w:pStyle w:val="Heading2"/>
         <w:spacing w:line="276" w:lineRule="auto"/>
+        <w:rPr>
+          <w:sz w:val="26"/>
+          <w:szCs w:val="26"/>
+        </w:rPr>
+      </w:pPr>
+      <w:r>
+        <w:rPr>
+          <w:sz w:val="26"/>
+          <w:szCs w:val="26"/>
+        </w:rPr>
+        <w:t>Dual Head</w:t>
+      </w:r>
+    </w:p>
+    <w:p>
+      <w:pPr>
+        <w:spacing w:after="60" w:line="276" w:lineRule="auto"/>
+      </w:pPr>
+      <w:r>
+        <w:lastRenderedPageBreak/>
+        <w:t xml:space="preserve">Từ </w:t>
+      </w:r>
+      <m:oMath>
+        <m:sSub>
+          <m:sSubPr>
+            <m:ctrlPr>
+              <w:rPr>
+                <w:rFonts w:ascii="Cambria Math" w:hAnsi="Cambria Math"/>
+              </w:rPr>
+            </m:ctrlPr>
+          </m:sSubPr>
+          <m:e>
+            <m:r>
+              <w:rPr>
+                <w:rFonts w:ascii="Cambria Math" w:hAnsi="Cambria Math"/>
+              </w:rPr>
+              <m:t>r</m:t>
+            </m:r>
+          </m:e>
+          <m:sub>
+            <m:r>
+              <w:rPr>
+                <w:rFonts w:ascii="Cambria Math" w:hAnsi="Cambria Math"/>
+              </w:rPr>
+              <m:t>i</m:t>
+            </m:r>
+          </m:sub>
+        </m:sSub>
+      </m:oMath>
+      <w:r>
+        <w:t>, model sử dụng hai head:</w:t>
+      </w:r>
+    </w:p>
+    <w:p>
+      <w:pPr>
+        <w:spacing w:before="160" w:after="60" w:line="276" w:lineRule="auto"/>
+      </w:pPr>
+      <w:r>
+        <w:rPr>
+          <w:b/>
+          <w:bCs/>
+        </w:rPr>
+        <w:t xml:space="preserve">Presence Head: </w:t>
+      </w:r>
+      <w:r>
+        <w:t>Linear(768 → 1) + sigmoid để sinh:</w:t>
+      </w:r>
+    </w:p>
+    <w:p>
+      <w:pPr>
+        <w:spacing w:before="120" w:after="120" w:line="276" w:lineRule="auto"/>
         <w:jc w:val="center"/>
       </w:pPr>
-      <w:r>
-        <w:t>Công thức Aspect-Aware Attention Pooling, với V là tập token hợp lệ sau khi loại padding bằng attention_mask:</w:t>
-      </w:r>
-    </w:p>
-    <w:p>
-      <w:pPr>
+      <m:oMathPara>
+        <m:oMath>
+          <m:sSub>
+            <m:sSubPr>
+              <m:ctrlPr>
+                <w:rPr>
+                  <w:rFonts w:ascii="Cambria Math" w:hAnsi="Cambria Math"/>
+                </w:rPr>
+              </m:ctrlPr>
+            </m:sSubPr>
+            <m:e>
+              <m:r>
+                <w:rPr>
+                  <w:rFonts w:ascii="Cambria Math" w:hAnsi="Cambria Math"/>
+                </w:rPr>
+                <m:t>p</m:t>
+              </m:r>
+            </m:e>
+            <m:sub>
+              <m:r>
+                <w:rPr>
+                  <w:rFonts w:ascii="Cambria Math" w:hAnsi="Cambria Math"/>
+                </w:rPr>
+                <m:t>i</m:t>
+              </m:r>
+            </m:sub>
+          </m:sSub>
+          <m:r>
+            <w:rPr>
+              <w:rFonts w:ascii="Cambria Math" w:hAnsi="Cambria Math"/>
+            </w:rPr>
+            <m:t xml:space="preserve"> = P(</m:t>
+          </m:r>
+          <m:sSub>
+            <m:sSubPr>
+              <m:ctrlPr>
+                <w:rPr>
+                  <w:rFonts w:ascii="Cambria Math" w:hAnsi="Cambria Math"/>
+                </w:rPr>
+              </m:ctrlPr>
+            </m:sSubPr>
+            <m:e>
+              <m:r>
+                <w:rPr>
+                  <w:rFonts w:ascii="Cambria Math" w:hAnsi="Cambria Math"/>
+                </w:rPr>
+                <m:t>aspect</m:t>
+              </m:r>
+            </m:e>
+            <m:sub>
+              <m:r>
+                <w:rPr>
+                  <w:rFonts w:ascii="Cambria Math" w:hAnsi="Cambria Math"/>
+                </w:rPr>
+                <m:t>i</m:t>
+              </m:r>
+            </m:sub>
+          </m:sSub>
+          <m:r>
+            <w:rPr>
+              <w:rFonts w:ascii="Cambria Math" w:hAnsi="Cambria Math"/>
+            </w:rPr>
+            <m:t xml:space="preserve"> present | review)</m:t>
+          </m:r>
+        </m:oMath>
+      </m:oMathPara>
+    </w:p>
+    <w:p>
+      <w:pPr>
+        <w:spacing w:after="120" w:line="276" w:lineRule="auto"/>
+      </w:pPr>
+      <w:r>
+        <w:t>Ngưỡng mặc định là 0.5; trong đánh giá notebook có thêm threshold tuning trên dev để tối ưu Combined F1.</w:t>
+      </w:r>
+    </w:p>
+    <w:p>
+      <w:pPr>
+        <w:spacing w:before="160" w:after="60" w:line="276" w:lineRule="auto"/>
+      </w:pPr>
+      <w:r>
+        <w:rPr>
+          <w:b/>
+          <w:bCs/>
+        </w:rPr>
+        <w:t xml:space="preserve">Sentiment Head: </w:t>
+      </w:r>
+      <w:r>
+        <w:t>MLP classifier cho ba sentiment khi aspect present. Kiến trúc cụ thể:</w:t>
+      </w:r>
+    </w:p>
+    <w:p>
+      <w:pPr>
+        <w:spacing w:before="120" w:after="120" w:line="276" w:lineRule="auto"/>
+        <w:jc w:val="center"/>
+      </w:pPr>
+      <w:r>
+        <w:rPr>
+          <w:rFonts w:eastAsia="Consolas"/>
+        </w:rPr>
+        <w:t>Linear(hidden → hidden) → GELU → Dropout(0.2) → LayerNorm → Linear(hidden → 4)</w:t>
+      </w:r>
+    </w:p>
+    <w:p>
+      <w:pPr>
+        <w:spacing w:after="120" w:line="276" w:lineRule="auto"/>
+      </w:pPr>
+      <w:r>
+        <w:t xml:space="preserve">Khi split loss, các logit sentiment chính là ba lớp </w:t>
+      </w:r>
+      <w:r>
+        <w:rPr>
+          <w:i/>
+          <w:iCs/>
+        </w:rPr>
+        <w:t>positive</w:t>
+      </w:r>
+      <w:r>
+        <w:t xml:space="preserve"> / </w:t>
+      </w:r>
+      <w:r>
+        <w:rPr>
+          <w:i/>
+          <w:iCs/>
+        </w:rPr>
+        <w:t>negative</w:t>
+      </w:r>
+      <w:r>
+        <w:t xml:space="preserve"> / </w:t>
+      </w:r>
+      <w:r>
+        <w:rPr>
+          <w:i/>
+          <w:iCs/>
+        </w:rPr>
+        <w:t>neutral</w:t>
+      </w:r>
+      <w:r>
+        <w:t>.</w:t>
+      </w:r>
+    </w:p>
+    <w:p>
+      <w:pPr>
+        <w:pStyle w:val="Heading2"/>
         <w:spacing w:line="276" w:lineRule="auto"/>
-      </w:pPr>
-      <w:r>
-        <w:t>k_j = tanh(W_proj h_j + b_proj), với W_proj ∈ R^(128×768)</w:t>
-      </w:r>
-    </w:p>
-    <w:p>
-      <w:pPr>
-        <w:spacing w:line="276" w:lineRule="auto"/>
-      </w:pPr>
-      <w:r>
-        <w:t>s_(i,j) = q_i^T k_j</w:t>
-      </w:r>
-    </w:p>
-    <w:p>
-      <w:pPr>
-        <w:spacing w:line="276" w:lineRule="auto"/>
-      </w:pPr>
-      <w:r>
-        <w:t>alpha_(i,j) = exp(s_(i,j)) / sum_{t in V} exp(s_(i,t))</w:t>
-      </w:r>
-    </w:p>
-    <w:p>
-      <w:pPr>
-        <w:spacing w:line="276" w:lineRule="auto"/>
-      </w:pPr>
-      <w:r>
-        <w:t>r_i = sum_{j in V} alpha_(i,j) h_j, với r_i ∈ R^768</w:t>
-      </w:r>
-    </w:p>
-    <w:p>
-      <w:pPr>
-        <w:spacing w:line="276" w:lineRule="auto"/>
-      </w:pPr>
-      <w:r>
-        <w:t>Vector r_i là representation riêng của aspect i. Ví dụ, với câu “Phòng sạch nhưng nhân viên phục vụ chậm”, aspect ROOMS#CLEANLINESS có xu hướng chú ý vào “Phòng”, “sạch”, còn SERVICE#GENERAL chú ý vào “nhân_viên”, “phục_vụ”, “chậm”. Đây là lý do attention pooling dễ giải thích hơn dùng một vector CLS chung cho mọi aspect.</w:t>
-      </w:r>
-    </w:p>
-    <w:p>
-      <w:pPr>
-        <w:spacing w:line="276" w:lineRule="auto"/>
-      </w:pPr>
-      <w:r>
-        <w:t>Từ r_i, model dùng hai head:</w:t>
-      </w:r>
-    </w:p>
-    <w:p>
-      <w:pPr>
-        <w:pStyle w:val="ListParagraph"/>
-        <w:spacing w:line="276" w:lineRule="auto"/>
-      </w:pPr>
-      <w:r>
-        <w:t>Presence Head: Linear(768→1) + sigmoid để sinh p_i = P(aspect_i present | review). Ngưỡng mặc định là 0.5; trong đánh giá notebook có thêm threshold tuning trên dev để tối ưu Combined F1.</w:t>
-      </w:r>
-    </w:p>
-    <w:p>
-      <w:pPr>
-        <w:pStyle w:val="ListParagraph"/>
-        <w:spacing w:line="276" w:lineRule="auto"/>
-      </w:pPr>
-      <w:r>
-        <w:t>Sentiment Head: MLP classifier cho ba sentiment khi aspect present. Trong code hiện tại, head dùng Linear(hidden→hidden) → GELU → Dropout(0.2) → LayerNorm → Linear(hidden→4); khi split loss, các logit sentiment chính là ba lớp positive/negative/neutral.</w:t>
-      </w:r>
-    </w:p>
-    <w:p>
-      <w:pPr>
-        <w:spacing w:line="276" w:lineRule="auto"/>
-      </w:pPr>
-      <w:r>
-        <w:t>Loss presence dùng Binary Cross-Entropy trên 34 aspect. Loss sentiment dùng Focal Cross-Entropy với γ = 2.0 trên các aspect present, giúp model tập trung hơn vào mẫu khó và giảm ảnh hưởng của class imbalance.</w:t>
+        <w:rPr>
+          <w:sz w:val="26"/>
+          <w:szCs w:val="26"/>
+        </w:rPr>
+      </w:pPr>
+      <w:r>
+        <w:rPr>
+          <w:sz w:val="26"/>
+          <w:szCs w:val="26"/>
+        </w:rPr>
+        <w:t>Loss Functions</w:t>
+      </w:r>
+    </w:p>
+    <w:p>
+      <w:pPr>
+        <w:spacing w:before="80" w:after="60" w:line="276" w:lineRule="auto"/>
+      </w:pPr>
+      <w:r>
+        <w:rPr>
+          <w:b/>
+          <w:bCs/>
+        </w:rPr>
+        <w:t xml:space="preserve">Loss presence: </w:t>
+      </w:r>
+      <w:r>
+        <w:t>Binary Cross-Entropy trên 34 aspect.</w:t>
+      </w:r>
+    </w:p>
+    <w:p>
+      <w:pPr>
+        <w:spacing w:before="80" w:after="60" w:line="276" w:lineRule="auto"/>
+      </w:pPr>
+      <w:r>
+        <w:rPr>
+          <w:b/>
+          <w:bCs/>
+        </w:rPr>
+        <w:t xml:space="preserve">Loss sentiment: </w:t>
+      </w:r>
+      <w:r>
+        <w:t xml:space="preserve">Focal Cross-Entropy với </w:t>
+      </w:r>
+      <m:oMath>
+        <m:r>
+          <w:rPr>
+            <w:rFonts w:ascii="Cambria Math" w:hAnsi="Cambria Math"/>
+          </w:rPr>
+          <m:t>γ = 2.0</m:t>
+        </m:r>
+      </m:oMath>
+      <w:r>
+        <w:t xml:space="preserve"> trên các aspect present, giúp model tập trung hơn vào mẫu khó và giảm ảnh hưởng của class imbalance.</w:t>
       </w:r>
     </w:p>
     <w:p>
@@ -6014,7 +7370,6 @@
         <w:spacing w:line="276" w:lineRule="auto"/>
       </w:pPr>
       <w:r>
-        <w:lastRenderedPageBreak/>
         <w:t>batch_size = 8, grad_accumulation_steps = 2: batch hiệu dụng 16, cân bằng giữa ổn định gradient và giới hạn VRAM.</w:t>
       </w:r>
     </w:p>
@@ -6102,6 +7457,7 @@
         <w:jc w:val="both"/>
       </w:pPr>
       <w:r>
+        <w:lastRenderedPageBreak/>
         <w:t xml:space="preserve">Đây là sản phẩm demo cuối cùng của </w:t>
       </w:r>
       <w:r>
@@ -6187,7 +7543,6 @@
         <w:jc w:val="both"/>
       </w:pPr>
       <w:r>
-        <w:lastRenderedPageBreak/>
         <w:t xml:space="preserve">Pipeline của </w:t>
       </w:r>
       <w:r>
@@ -6285,6 +7640,7 @@
         <w:spacing w:before="40" w:after="40" w:line="276" w:lineRule="auto"/>
       </w:pPr>
       <w:r>
+        <w:lastRenderedPageBreak/>
         <w:t>Streamlit UI hiển thị kết quả có cấu trúc: aspect list với màu sentiment, evidence highlighted trong review, explanation dưới dạng bullet, và recommended_action cuối trang.</w:t>
       </w:r>
     </w:p>
@@ -6386,7 +7742,6 @@
         <w:spacing w:line="276" w:lineRule="auto"/>
       </w:pPr>
       <w:r>
-        <w:lastRenderedPageBreak/>
         <w:t>6.1 Setup thí nghiệm</w:t>
       </w:r>
     </w:p>
@@ -6530,6 +7885,7 @@
                 <w:sz w:val="24"/>
                 <w:szCs w:val="24"/>
               </w:rPr>
+              <w:lastRenderedPageBreak/>
               <w:t>Method</w:t>
             </w:r>
           </w:p>
@@ -7208,7 +8564,6 @@
         <w:spacing w:line="276" w:lineRule="auto"/>
       </w:pPr>
       <w:r>
-        <w:lastRenderedPageBreak/>
         <w:t>Ablation concat_4_layers cho thấy biểu diễn lớn hơn không luôn tốt hơn trên 3.000 train samples: cls_only nhẹ hơn nhưng SPC F1 cao hơn, nên được chọn làm best single model.</w:t>
       </w:r>
     </w:p>
@@ -7766,7 +9121,11 @@
         <w:jc w:val="both"/>
       </w:pPr>
       <w:r>
-        <w:t>Chênh lệch giữa dev và test rất nhỏ (&lt; 0.01 trên Combined F1), chứng tỏ baseline ổn định và không overfit. Điểm đáng chú ý là SPC F1 (0.2272) thấp hơn ACD F1 (0.4074) đáng kể — mức chênh ~0.18 điểm. Nguyên nhân chính: TF-IDF không bắt được context phủ định, so sánh, emphasis — những cue quyết định việc phân biệt positive vs negative vs neutral. Ví dụ hai câu "phòng không sạch" và "phòng sạch" có TF-IDF feature rất giống nhau ở unigram (chỉ khác ở từ "không" — một token unigram riêng biệt), và bigram "phòng không" chưa chắc đủ thông tin. Trong khi đó, bài toán ACD (xuất hiện hay không) phụ thuộc nhiều hơn vào từ khóa rõ ràng ("phòng" xuất hiện → ROOMS được nhắc) nên SVM làm tốt hơn.</w:t>
+        <w:t xml:space="preserve">Chênh lệch giữa dev và test rất nhỏ (&lt; 0.01 trên Combined F1), chứng tỏ baseline ổn định và không overfit. Điểm đáng chú ý là SPC F1 (0.2272) thấp hơn ACD F1 (0.4074) đáng kể — mức chênh ~0.18 điểm. Nguyên nhân chính: TF-IDF không bắt được context phủ định, so sánh, emphasis — những cue quyết định việc phân biệt positive vs negative </w:t>
+      </w:r>
+      <w:r>
+        <w:lastRenderedPageBreak/>
+        <w:t>vs neutral. Ví dụ hai câu "phòng không sạch" và "phòng sạch" có TF-IDF feature rất giống nhau ở unigram (chỉ khác ở từ "không" — một token unigram riêng biệt), và bigram "phòng không" chưa chắc đủ thông tin. Trong khi đó, bài toán ACD (xuất hiện hay không) phụ thuộc nhiều hơn vào từ khóa rõ ràng ("phòng" xuất hiện → ROOMS được nhắc) nên SVM làm tốt hơn.</w:t>
       </w:r>
     </w:p>
     <w:p>
@@ -8316,7 +9675,6 @@
         <w:jc w:val="both"/>
       </w:pPr>
       <w:r>
-        <w:lastRenderedPageBreak/>
         <w:t>Giải thích cơ chế: PhoBERT được pretrain trên corpus tiếng Việt đã được word-segmented bằng VnCoreNLP. Trong vocabulary của PhoBERT, các token như "khách_sạn", "nhân_viên", "dịch_vụ" tồn tại như các đơn vị quen thuộc với embedding được học tốt. Khi fine-tune trên text không segmented, model thấy "khách" và "sạn" rời nhau — hai token mà embedding pretrained không mã hóa đủ thông tin về cụm từ ghép này. Kết quả là model phải học lại ngữ nghĩa từ đầu chỉ với 3.000 train sample — điều không đủ cho một task phức tạp 34 × 4 label.</w:t>
       </w:r>
     </w:p>
@@ -8388,6 +9746,7 @@
         <w:jc w:val="both"/>
       </w:pPr>
       <w:r>
+        <w:lastRenderedPageBreak/>
         <w:t>Yếu tố 1 — VnCoreNLP word segmentation là quyết định nhất (+0,3537 Combined F1, +131,9%): PhoBERT pretrain trên ~20GB corpus tiếng Việt đã word-segment. Vocabulary chứa token như "khách_sạn", "nhân_viên" với embedding được học tốt. Fine-tune trên text không segment buộc model thấy "khách" và "sạn" rời nhau — token OOV mà pretrained embedding không mã hóa đủ nghĩa cụm từ ghép. Model phải học lại từ đầu với 2.400 train sample cho task 34×4 label — không đủ. Kết quả Combined F1 dừng ở ~0,26, thua cả SVM TF-IDF.</w:t>
       </w:r>
     </w:p>
@@ -8429,7 +9788,6 @@
         <w:jc w:val="both"/>
       </w:pPr>
       <w:r>
-        <w:lastRenderedPageBreak/>
         <w:t>Phần này trình bày kết quả đánh giá định lượng chất lượng của thành phần LLM Explanation trong hệ thống ứng dụng ở phần 5.4. Vì LLM đóng vai trò explainer không phải classifier nên không có metric F1 để đo trực tiếp. Nhóm thiết kế ba phương pháp đánh giá độc lập, mỗi phương pháp kiểm chứng một loại hallucination khác nhau — gọi tắt là M1, M2, M3 — được chạy trên N = 200 mẫu từ tập test với GPT-4o-mini trên môi trường Kaggle T4.</w:t>
       </w:r>
     </w:p>
@@ -8469,7 +9827,11 @@
         <w:t>t),</w:t>
       </w:r>
       <w:r>
-        <w:t xml:space="preserve"> item đó bị drop. Nếu LLM đổi sentiment khác với PhoBERT, sentiment được restore về đúng nhãn gốc. Sau khi chạy xong, đọc lại metadata về số lượng bị drop và bị sửa. Cả hai đều bằng 0 đồng nghĩa LLM tuân thủ hoàn toàn label scheme của PhoBERT.</w:t>
+        <w:t xml:space="preserve"> item đó bị drop. Nếu LLM đổi sentiment khác với PhoBERT, sentiment được restore về đúng nhãn gốc. Sau khi chạy xong, đọc </w:t>
+      </w:r>
+      <w:r>
+        <w:lastRenderedPageBreak/>
+        <w:t>lại metadata về số lượng bị drop và bị sửa. Cả hai đều bằng 0 đồng nghĩa LLM tuân thủ hoàn toàn label scheme của PhoBERT.</w:t>
       </w:r>
     </w:p>
     <w:tbl>
@@ -9038,7 +10400,6 @@
         <w:jc w:val="both"/>
       </w:pPr>
       <w:r>
-        <w:lastRenderedPageBreak/>
         <w:t xml:space="preserve">Phương pháp: với mỗi explanation item có evidence khác rỗng, tính BERTScore F1 giữa chuỗi evidence và review gốc: F1(evidence, review). Score cao cho thấy các token trong evidence xuất hiện (về mặt ngữ nghĩa) trong review gốc, tức evidence được trích từ review thật chứ không phải bịa. Backbone dùng vinai/phobert-base-v2 (num_layers=10) — PhoBERT là model pretrain trên tiếng Việt, phù hợp hơn BERT-base-multilingual cho cặp chuỗi tiếng Việt. Tham số num_layers=10 là bắt buộc vì PhoBERT không có trong registry mặc định của thư viện bert_score (registry chỉ chứa khoảng 130 model đã biết). </w:t>
       </w:r>
     </w:p>
@@ -9581,6 +10942,7 @@
           <w:sz w:val="22"/>
           <w:szCs w:val="22"/>
         </w:rPr>
+        <w:lastRenderedPageBreak/>
         <w:t>Bảng 12. Kết quả M2 — BERTScore Evidence Groundedness trên 200 mẫu test.</w:t>
       </w:r>
     </w:p>
@@ -9617,11 +10979,7 @@
         <w:jc w:val="both"/>
       </w:pPr>
       <w:r>
-        <w:t xml:space="preserve">Hai tiêu chí annotation: (1) Faithfulness (0–2): 0 = hallucination (thông tin bịa không tồn tại trong review), 1 = phần lớn trung thực (suy diễn hơi quá hoặc khái quát lệch nhẹ nhưng không sai thực chất), 2 = hoàn toàn trung thực (evidence và explanation đều có căn cứ rõ ràng từ review). (2) Usefulness (0–2): 0 = không hữu ích, 1 = hữu ích một </w:t>
-      </w:r>
-      <w:r>
-        <w:lastRenderedPageBreak/>
-        <w:t>phần (đúng hướng nhưng chung chung hoặc một phần không thực tế), 2 = rất hữu ích (cụ thể, actionable, phù hợp với aspect và sentiment).</w:t>
+        <w:t>Hai tiêu chí annotation: (1) Faithfulness (0–2): 0 = hallucination (thông tin bịa không tồn tại trong review), 1 = phần lớn trung thực (suy diễn hơi quá hoặc khái quát lệch nhẹ nhưng không sai thực chất), 2 = hoàn toàn trung thực (evidence và explanation đều có căn cứ rõ ràng từ review). (2) Usefulness (0–2): 0 = không hữu ích, 1 = hữu ích một phần (đúng hướng nhưng chung chung hoặc một phần không thực tế), 2 = rất hữu ích (cụ thể, actionable, phù hợp với aspect và sentiment).</w:t>
       </w:r>
     </w:p>
     <w:p>
@@ -10232,6 +11590,7 @@
           <w:sz w:val="22"/>
           <w:szCs w:val="22"/>
         </w:rPr>
+        <w:lastRenderedPageBreak/>
         <w:t>Bảng 13. Kết quả M3 — Human Rubric trên 30 mẫu được chọn ngẫu nhiên.</w:t>
       </w:r>
     </w:p>
@@ -10574,7 +11933,6 @@
                 <w:sz w:val="22"/>
                 <w:szCs w:val="22"/>
               </w:rPr>
-              <w:lastRenderedPageBreak/>
               <w:t>M2 — BERTScore Evidence</w:t>
             </w:r>
           </w:p>
@@ -10959,7 +12317,11 @@
         <w:jc w:val="both"/>
       </w:pPr>
       <w:r>
-        <w:t>M1 = 100% Label Consistency: Kết quả tốt nhất có thể, phản ánh kiến trúc đúng đắn: LLM nhận danh sách aspect/sentiment đã predict từ PhoBERT làm input, không tự suy ra nhãn mới. Pipeline dùng ràng buộc cứng — validate_explanation_items() kiểm tra từng item và tự động drop/restore nếu LLM vi phạm. 100% không phải ngẫu nhiên mà là hệ quả của phân vai rõ ràng: PhoBERT = classifier (chịu trách nhiệm nhãn), LLM = explainer (chịu trách nhiệm ngôn ngữ). Đây là ưu điểm cốt lõi so với hệ thống end-to-end LLM vừa classify vừa explain, nơi nhãn thường bị drift.</w:t>
+        <w:t xml:space="preserve">M1 = 100% Label Consistency: Kết quả tốt nhất có thể, phản ánh kiến trúc đúng đắn: LLM nhận danh sách aspect/sentiment đã predict từ PhoBERT làm input, không tự suy ra nhãn mới. Pipeline dùng ràng buộc cứng — validate_explanation_items() kiểm tra từng item và tự động drop/restore nếu LLM vi phạm. 100% không phải ngẫu nhiên mà là hệ quả của phân vai rõ ràng: PhoBERT = classifier (chịu trách nhiệm nhãn), LLM = explainer (chịu trách </w:t>
+      </w:r>
+      <w:r>
+        <w:lastRenderedPageBreak/>
+        <w:t>nhiệm ngôn ngữ). Đây là ưu điểm cốt lõi so với hệ thống end-to-end LLM vừa classify vừa explain, nơi nhãn thường bị drift.</w:t>
       </w:r>
     </w:p>
     <w:p>
@@ -11001,11 +12363,7 @@
         <w:jc w:val="both"/>
       </w:pPr>
       <w:r>
-        <w:t xml:space="preserve">M3 — Human Rubric Usefulness = 1,667/2: Thấp hơn Faithfulness một chút vì recommended_action phụ thuộc common sense rộng hơn. 66,7% gợi ý đạt score=2 (rất cụ thể và actionable). 6 trường hợp score=1 là gợi ý đúng hướng </w:t>
-      </w:r>
-      <w:r>
-        <w:lastRenderedPageBreak/>
-        <w:t>nhưng không thực thi được (vị trí khách sạn, bãi biển công cộng) — giới hạn của LLM thiếu domain knowledge, không phải hallucination. Trong ứng dụng thực, độ hữu ích cải thiện đáng kể khi bổ sung context (loại phòng, mức sao, ...) vào prompt.</w:t>
+        <w:t>M3 — Human Rubric Usefulness = 1,667/2: Thấp hơn Faithfulness một chút vì recommended_action phụ thuộc common sense rộng hơn. 66,7% gợi ý đạt score=2 (rất cụ thể và actionable). 6 trường hợp score=1 là gợi ý đúng hướng nhưng không thực thi được (vị trí khách sạn, bãi biển công cộng) — giới hạn của LLM thiếu domain knowledge, không phải hallucination. Trong ứng dụng thực, độ hữu ích cải thiện đáng kể khi bổ sung context (loại phòng, mức sao, ...) vào prompt.</w:t>
       </w:r>
     </w:p>
     <w:p>
@@ -11072,6 +12430,7 @@
         <w:spacing w:line="276" w:lineRule="auto"/>
       </w:pPr>
       <w:r>
+        <w:lastRenderedPageBreak/>
         <w:t>Nguyên nhân 3 — Tuning budget: nhóm chỉ chạy một số cấu hình thực dụng trên Kaggle T4, trong khi SOTA là công trình nghiên cứu riêng có điều kiện thử nhiều cấu hình hơn.</w:t>
       </w:r>
     </w:p>
@@ -11140,7 +12499,6 @@
         <w:spacing w:line="276" w:lineRule="auto"/>
       </w:pPr>
       <w:r>
-        <w:lastRenderedPageBreak/>
         <w:t>Báo cáo đã xây dựng đầy đủ một pipeline ABSA cho review khách sạn tiếng Việt, gồm baseline truyền thống, PhoBERT predictor và ứng dụng PhoBERT + LLM Explanation. Kết quả chính không chỉ nằm ở điểm F1 mà còn ở việc chứng minh được từng tầng xử lý có vai trò cụ thể.</w:t>
       </w:r>
     </w:p>
@@ -11207,6 +12565,7 @@
         <w:spacing w:line="276" w:lineRule="auto"/>
       </w:pPr>
       <w:r>
+        <w:lastRenderedPageBreak/>
         <w:t xml:space="preserve">Sản phẩm cuối cùng là </w:t>
       </w:r>
       <w:r>
@@ -11274,7 +12633,6 @@
         <w:spacing w:before="40" w:after="40" w:line="276" w:lineRule="auto"/>
       </w:pPr>
       <w:r>
-        <w:lastRenderedPageBreak/>
         <w:t>Dataset chỉ có 3.000 review train, một số aspect cực hiếm (ROOMS#MISCELLANEOUS, ROOM_AMENITIES#PRICES) mà model không đủ signal để học — F1 gần như chắc chắn thấp với mọi phương pháp.</w:t>
       </w:r>
     </w:p>
@@ -11366,6 +12724,7 @@
         <w:spacing w:before="40" w:after="40" w:line="276" w:lineRule="auto"/>
       </w:pPr>
       <w:r>
+        <w:lastRenderedPageBreak/>
         <w:t>Áp dụng data augmentation để cải thiện hiệu quả học trên các aspect có tần suất xuất hiện thấp.</w:t>
       </w:r>
     </w:p>

</xml_diff>